<commit_message>
docs: actualizar Anexo A del informe con URL del repositorio y del sistema en línea
</commit_message>
<xml_diff>
--- a/docs/informe/Informe_Tecnico.docx
+++ b/docs/informe/Informe_Tecnico.docx
@@ -9102,7 +9102,22 @@
           <w:sz w:val="24"/>
           <w:szCs w:val="24"/>
         </w:rPr>
-        <w:t xml:space="preserve">Repositorio de GitHub: [URL DEL REPOSITORIO]. Carpetas principales: backend/, frontend/, database/ y docs/.</w:t>
+        <w:t xml:space="preserve">Repositorio de GitHub: https://github.com/Jose-An608/io2-sistema-decisiones. Carpetas principales: backend/, frontend/, database/ y docs/.</w:t>
+      </w:r>
+    </w:p>
+    <w:p>
+      <w:pPr>
+        <w:spacing w:after="0" w:line="480"/>
+        <w:ind w:firstLine="720"/>
+        <w:jc w:val="left"/>
+      </w:pPr>
+      <w:r>
+        <w:rPr>
+          <w:rFonts w:ascii="Times New Roman" w:cs="Times New Roman" w:eastAsia="Times New Roman" w:hAnsi="Times New Roman"/>
+          <w:sz w:val="24"/>
+          <w:szCs w:val="24"/>
+        </w:rPr>
+        <w:t xml:space="preserve">Sistema en línea (Render, con base de datos en Azure SQL): https://io2-sistema-decisiones.onrender.com. Verificación de la conexión a la base de datos: https://io2-sistema-decisiones.onrender.com/api/health. Nota: en el plan gratuito de Render el servicio se suspende tras 15 minutos de inactividad y la primera solicitud puede tardar cerca de un minuto.</w:t>
       </w:r>
     </w:p>
     <w:p>

</xml_diff>

<commit_message>
docs: agregar integrantes, docente y fecha en README e informe
</commit_message>
<xml_diff>
--- a/docs/informe/Informe_Tecnico.docx
+++ b/docs/informe/Informe_Tecnico.docx
@@ -59,7 +59,63 @@
           <w:sz w:val="24"/>
           <w:szCs w:val="24"/>
         </w:rPr>
-        <w:t xml:space="preserve">[Nombres y apellidos del estudiante]</w:t>
+        <w:t xml:space="preserve">Dante Vicente Alvarez Tapia</w:t>
+      </w:r>
+    </w:p>
+    <w:p>
+      <w:pPr>
+        <w:spacing w:after="0" w:line="480"/>
+        <w:jc w:val="left"/>
+      </w:pPr>
+      <w:r>
+        <w:rPr>
+          <w:rFonts w:ascii="Times New Roman" w:cs="Times New Roman" w:eastAsia="Times New Roman" w:hAnsi="Times New Roman"/>
+          <w:sz w:val="24"/>
+          <w:szCs w:val="24"/>
+        </w:rPr>
+        <w:t xml:space="preserve">Alexander Fermin Chicalla Garcia</w:t>
+      </w:r>
+    </w:p>
+    <w:p>
+      <w:pPr>
+        <w:spacing w:after="0" w:line="480"/>
+        <w:jc w:val="left"/>
+      </w:pPr>
+      <w:r>
+        <w:rPr>
+          <w:rFonts w:ascii="Times New Roman" w:cs="Times New Roman" w:eastAsia="Times New Roman" w:hAnsi="Times New Roman"/>
+          <w:sz w:val="24"/>
+          <w:szCs w:val="24"/>
+        </w:rPr>
+        <w:t xml:space="preserve">Cristian Chura Peralta</w:t>
+      </w:r>
+    </w:p>
+    <w:p>
+      <w:pPr>
+        <w:spacing w:after="0" w:line="480"/>
+        <w:jc w:val="left"/>
+      </w:pPr>
+      <w:r>
+        <w:rPr>
+          <w:rFonts w:ascii="Times New Roman" w:cs="Times New Roman" w:eastAsia="Times New Roman" w:hAnsi="Times New Roman"/>
+          <w:sz w:val="24"/>
+          <w:szCs w:val="24"/>
+        </w:rPr>
+        <w:t xml:space="preserve">Jose Antonio Vilcanqui Chambi</w:t>
+      </w:r>
+    </w:p>
+    <w:p>
+      <w:pPr>
+        <w:spacing w:after="0" w:line="480"/>
+        <w:jc w:val="left"/>
+      </w:pPr>
+      <w:r>
+        <w:rPr>
+          <w:rFonts w:ascii="Times New Roman" w:cs="Times New Roman" w:eastAsia="Times New Roman" w:hAnsi="Times New Roman"/>
+          <w:sz w:val="24"/>
+          <w:szCs w:val="24"/>
+        </w:rPr>
+        <w:t xml:space="preserve">Brayhan Deyvid Quispe Cama</w:t>
       </w:r>
     </w:p>
     <w:p>
@@ -101,21 +157,21 @@
           <w:sz w:val="24"/>
           <w:szCs w:val="24"/>
         </w:rPr>
-        <w:t xml:space="preserve">[Nombre del docente]</w:t>
-      </w:r>
-    </w:p>
-    <w:p>
-      <w:pPr>
-        <w:spacing w:after="0" w:line="480"/>
-        <w:jc w:val="left"/>
-      </w:pPr>
-      <w:r>
-        <w:rPr>
-          <w:rFonts w:ascii="Times New Roman" w:cs="Times New Roman" w:eastAsia="Times New Roman" w:hAnsi="Times New Roman"/>
-          <w:sz w:val="24"/>
-          <w:szCs w:val="24"/>
-        </w:rPr>
-        <w:t xml:space="preserve">[Día de Mes de Año]</w:t>
+        <w:t xml:space="preserve">MSc. Manuel Yuri Apaza Valencia</w:t>
+      </w:r>
+    </w:p>
+    <w:p>
+      <w:pPr>
+        <w:spacing w:after="0" w:line="480"/>
+        <w:jc w:val="left"/>
+      </w:pPr>
+      <w:r>
+        <w:rPr>
+          <w:rFonts w:ascii="Times New Roman" w:cs="Times New Roman" w:eastAsia="Times New Roman" w:hAnsi="Times New Roman"/>
+          <w:sz w:val="24"/>
+          <w:szCs w:val="24"/>
+        </w:rPr>
+        <w:t xml:space="preserve">14 de octubre de 2026</w:t>
       </w:r>
     </w:p>
     <w:p>
@@ -626,7 +682,7 @@
           <w:sz w:val="24"/>
           <w:szCs w:val="24"/>
         </w:rPr>
-        <w:t xml:space="preserve"> el instructivo indica elegir una alternativa por grupo; en este trabajo, de ejecución individual, se implementaron las tres para integrar toda la asignatura.</w:t>
+        <w:t xml:space="preserve"> el instructivo indica elegir una alternativa por grupo; en este trabajo se implementaron las tres para integrar toda la asignatura.</w:t>
       </w:r>
     </w:p>
     <w:p>

</xml_diff>

<commit_message>
docs: centrar portada y justificar texto del informe
</commit_message>
<xml_diff>
--- a/docs/informe/Informe_Tecnico.docx
+++ b/docs/informe/Informe_Tecnico.docx
@@ -4,33 +4,13 @@
   <w:body>
     <w:p>
       <w:pPr>
-        <w:spacing w:after="0" w:line="240"/>
-      </w:pPr>
-    </w:p>
-    <w:p>
-      <w:pPr>
-        <w:spacing w:after="0" w:line="240"/>
-      </w:pPr>
-    </w:p>
-    <w:p>
-      <w:pPr>
-        <w:spacing w:after="0" w:line="240"/>
-      </w:pPr>
-    </w:p>
-    <w:p>
-      <w:pPr>
-        <w:spacing w:after="0" w:line="240"/>
-      </w:pPr>
-    </w:p>
-    <w:p>
-      <w:pPr>
-        <w:spacing w:after="0" w:line="240"/>
-      </w:pPr>
-    </w:p>
-    <w:p>
-      <w:pPr>
-        <w:spacing w:after="0" w:line="480"/>
-        <w:jc w:val="left"/>
+        <w:spacing w:after="0" w:before="2900" w:line="240"/>
+      </w:pPr>
+    </w:p>
+    <w:p>
+      <w:pPr>
+        <w:spacing w:after="0" w:line="480"/>
+        <w:jc w:val="center"/>
       </w:pPr>
       <w:r>
         <w:rPr>
@@ -51,7 +31,7 @@
     <w:p>
       <w:pPr>
         <w:spacing w:after="0" w:line="480"/>
-        <w:jc w:val="left"/>
+        <w:jc w:val="center"/>
       </w:pPr>
       <w:r>
         <w:rPr>
@@ -65,7 +45,7 @@
     <w:p>
       <w:pPr>
         <w:spacing w:after="0" w:line="480"/>
-        <w:jc w:val="left"/>
+        <w:jc w:val="center"/>
       </w:pPr>
       <w:r>
         <w:rPr>
@@ -79,7 +59,7 @@
     <w:p>
       <w:pPr>
         <w:spacing w:after="0" w:line="480"/>
-        <w:jc w:val="left"/>
+        <w:jc w:val="center"/>
       </w:pPr>
       <w:r>
         <w:rPr>
@@ -93,7 +73,7 @@
     <w:p>
       <w:pPr>
         <w:spacing w:after="0" w:line="480"/>
-        <w:jc w:val="left"/>
+        <w:jc w:val="center"/>
       </w:pPr>
       <w:r>
         <w:rPr>
@@ -107,7 +87,7 @@
     <w:p>
       <w:pPr>
         <w:spacing w:after="0" w:line="480"/>
-        <w:jc w:val="left"/>
+        <w:jc w:val="center"/>
       </w:pPr>
       <w:r>
         <w:rPr>
@@ -121,7 +101,7 @@
     <w:p>
       <w:pPr>
         <w:spacing w:after="0" w:line="480"/>
-        <w:jc w:val="left"/>
+        <w:jc w:val="center"/>
       </w:pPr>
       <w:r>
         <w:rPr>
@@ -135,7 +115,7 @@
     <w:p>
       <w:pPr>
         <w:spacing w:after="0" w:line="480"/>
-        <w:jc w:val="left"/>
+        <w:jc w:val="center"/>
       </w:pPr>
       <w:r>
         <w:rPr>
@@ -149,7 +129,7 @@
     <w:p>
       <w:pPr>
         <w:spacing w:after="0" w:line="480"/>
-        <w:jc w:val="left"/>
+        <w:jc w:val="center"/>
       </w:pPr>
       <w:r>
         <w:rPr>
@@ -163,7 +143,7 @@
     <w:p>
       <w:pPr>
         <w:spacing w:after="0" w:line="480"/>
-        <w:jc w:val="left"/>
+        <w:jc w:val="center"/>
       </w:pPr>
       <w:r>
         <w:rPr>
@@ -222,7 +202,7 @@
       <w:pPr>
         <w:spacing w:after="0" w:line="480"/>
         <w:ind w:firstLine="720"/>
-        <w:jc w:val="left"/>
+        <w:jc w:val="both"/>
       </w:pPr>
       <w:r>
         <w:rPr>
@@ -237,7 +217,7 @@
       <w:pPr>
         <w:spacing w:after="0" w:line="480"/>
         <w:ind w:firstLine="720"/>
-        <w:jc w:val="left"/>
+        <w:jc w:val="both"/>
       </w:pPr>
       <w:r>
         <w:rPr>
@@ -270,7 +250,7 @@
       <w:pPr>
         <w:spacing w:after="0" w:line="480"/>
         <w:ind w:firstLine="720"/>
-        <w:jc w:val="left"/>
+        <w:jc w:val="both"/>
       </w:pPr>
       <w:r>
         <w:rPr>
@@ -302,7 +282,7 @@
       <w:pPr>
         <w:spacing w:after="0" w:line="480"/>
         <w:ind w:firstLine="720"/>
-        <w:jc w:val="left"/>
+        <w:jc w:val="both"/>
       </w:pPr>
       <w:r>
         <w:rPr>
@@ -321,6 +301,7 @@
           <w:numId w:val="2"/>
         </w:numPr>
         <w:spacing w:after="0" w:line="480"/>
+        <w:jc w:val="both"/>
       </w:pPr>
       <w:r>
         <w:rPr>
@@ -349,6 +330,7 @@
           <w:numId w:val="2"/>
         </w:numPr>
         <w:spacing w:after="0" w:line="480"/>
+        <w:jc w:val="both"/>
       </w:pPr>
       <w:r>
         <w:rPr>
@@ -377,6 +359,7 @@
           <w:numId w:val="2"/>
         </w:numPr>
         <w:spacing w:after="0" w:line="480"/>
+        <w:jc w:val="both"/>
       </w:pPr>
       <w:r>
         <w:rPr>
@@ -401,7 +384,7 @@
       <w:pPr>
         <w:spacing w:after="0" w:line="480"/>
         <w:ind w:firstLine="720"/>
-        <w:jc w:val="left"/>
+        <w:jc w:val="both"/>
       </w:pPr>
       <w:r>
         <w:rPr>
@@ -450,7 +433,7 @@
       <w:pPr>
         <w:spacing w:after="0" w:line="480"/>
         <w:ind w:firstLine="720"/>
-        <w:jc w:val="left"/>
+        <w:jc w:val="both"/>
       </w:pPr>
       <w:r>
         <w:rPr>
@@ -486,6 +469,7 @@
           <w:numId w:val="2"/>
         </w:numPr>
         <w:spacing w:after="0" w:line="480"/>
+        <w:jc w:val="both"/>
       </w:pPr>
       <w:r>
         <w:rPr>
@@ -504,6 +488,7 @@
           <w:numId w:val="2"/>
         </w:numPr>
         <w:spacing w:after="0" w:line="480"/>
+        <w:jc w:val="both"/>
       </w:pPr>
       <w:r>
         <w:rPr>
@@ -522,6 +507,7 @@
           <w:numId w:val="2"/>
         </w:numPr>
         <w:spacing w:after="0" w:line="480"/>
+        <w:jc w:val="both"/>
       </w:pPr>
       <w:r>
         <w:rPr>
@@ -540,6 +526,7 @@
           <w:numId w:val="2"/>
         </w:numPr>
         <w:spacing w:after="0" w:line="480"/>
+        <w:jc w:val="both"/>
       </w:pPr>
       <w:r>
         <w:rPr>
@@ -558,6 +545,7 @@
           <w:numId w:val="2"/>
         </w:numPr>
         <w:spacing w:after="0" w:line="480"/>
+        <w:jc w:val="both"/>
       </w:pPr>
       <w:r>
         <w:rPr>
@@ -589,7 +577,7 @@
       <w:pPr>
         <w:spacing w:after="0" w:line="480"/>
         <w:ind w:firstLine="720"/>
-        <w:jc w:val="left"/>
+        <w:jc w:val="both"/>
       </w:pPr>
       <w:r>
         <w:rPr>
@@ -614,7 +602,7 @@
       <w:pPr>
         <w:spacing w:after="0" w:line="480"/>
         <w:ind w:firstLine="720"/>
-        <w:jc w:val="left"/>
+        <w:jc w:val="both"/>
       </w:pPr>
       <w:r>
         <w:rPr>
@@ -639,7 +627,7 @@
       <w:pPr>
         <w:spacing w:after="0" w:line="480"/>
         <w:ind w:firstLine="720"/>
-        <w:jc w:val="left"/>
+        <w:jc w:val="both"/>
       </w:pPr>
       <w:r>
         <w:rPr>
@@ -664,7 +652,7 @@
       <w:pPr>
         <w:spacing w:after="0" w:line="480"/>
         <w:ind w:firstLine="720"/>
-        <w:jc w:val="left"/>
+        <w:jc w:val="both"/>
       </w:pPr>
       <w:r>
         <w:rPr>
@@ -723,7 +711,7 @@
       <w:pPr>
         <w:spacing w:after="0" w:line="480"/>
         <w:ind w:firstLine="720"/>
-        <w:jc w:val="left"/>
+        <w:jc w:val="both"/>
       </w:pPr>
       <w:r>
         <w:rPr>
@@ -809,7 +797,7 @@
       <w:pPr>
         <w:spacing w:after="0" w:line="480"/>
         <w:ind w:firstLine="720"/>
-        <w:jc w:val="left"/>
+        <w:jc w:val="both"/>
       </w:pPr>
       <w:r>
         <w:rPr>
@@ -949,7 +937,7 @@
       <w:pPr>
         <w:spacing w:after="0" w:line="480"/>
         <w:ind w:firstLine="720"/>
-        <w:jc w:val="left"/>
+        <w:jc w:val="both"/>
       </w:pPr>
       <w:r>
         <w:rPr>
@@ -1178,7 +1166,7 @@
       <w:pPr>
         <w:spacing w:after="0" w:line="480"/>
         <w:ind w:firstLine="720"/>
-        <w:jc w:val="left"/>
+        <w:jc w:val="both"/>
       </w:pPr>
       <w:r>
         <w:rPr>
@@ -1273,7 +1261,7 @@
       <w:pPr>
         <w:spacing w:after="0" w:line="480"/>
         <w:ind w:firstLine="720"/>
-        <w:jc w:val="left"/>
+        <w:jc w:val="both"/>
       </w:pPr>
       <w:r>
         <w:rPr>
@@ -1305,7 +1293,7 @@
       <w:pPr>
         <w:spacing w:after="0" w:line="480"/>
         <w:ind w:firstLine="720"/>
-        <w:jc w:val="left"/>
+        <w:jc w:val="both"/>
       </w:pPr>
       <w:r>
         <w:rPr>
@@ -1384,7 +1372,7 @@
       <w:pPr>
         <w:spacing w:after="0" w:line="480"/>
         <w:ind w:firstLine="720"/>
-        <w:jc w:val="left"/>
+        <w:jc w:val="both"/>
       </w:pPr>
       <w:r>
         <w:rPr>
@@ -1416,7 +1404,7 @@
       <w:pPr>
         <w:spacing w:after="0" w:line="480"/>
         <w:ind w:firstLine="720"/>
-        <w:jc w:val="left"/>
+        <w:jc w:val="both"/>
       </w:pPr>
       <w:r>
         <w:rPr>
@@ -1495,7 +1483,7 @@
       <w:pPr>
         <w:spacing w:after="0" w:line="480"/>
         <w:ind w:firstLine="720"/>
-        <w:jc w:val="left"/>
+        <w:jc w:val="both"/>
       </w:pPr>
       <w:r>
         <w:rPr>
@@ -2052,7 +2040,7 @@
       <w:pPr>
         <w:spacing w:after="0" w:line="480"/>
         <w:ind w:firstLine="720"/>
-        <w:jc w:val="left"/>
+        <w:jc w:val="both"/>
       </w:pPr>
       <w:r>
         <w:rPr>
@@ -2407,7 +2395,7 @@
       <w:pPr>
         <w:spacing w:after="0" w:line="480"/>
         <w:ind w:firstLine="720"/>
-        <w:jc w:val="left"/>
+        <w:jc w:val="both"/>
       </w:pPr>
       <w:r>
         <w:rPr>
@@ -2541,7 +2529,7 @@
       <w:pPr>
         <w:spacing w:after="0" w:line="480"/>
         <w:ind w:firstLine="720"/>
-        <w:jc w:val="left"/>
+        <w:jc w:val="both"/>
       </w:pPr>
       <w:r>
         <w:rPr>
@@ -3605,7 +3593,7 @@
       <w:pPr>
         <w:spacing w:after="0" w:line="480"/>
         <w:ind w:firstLine="720"/>
-        <w:jc w:val="left"/>
+        <w:jc w:val="both"/>
       </w:pPr>
       <w:r>
         <w:rPr>
@@ -3637,7 +3625,7 @@
       <w:pPr>
         <w:spacing w:after="0" w:line="480"/>
         <w:ind w:firstLine="720"/>
-        <w:jc w:val="left"/>
+        <w:jc w:val="both"/>
       </w:pPr>
       <w:r>
         <w:rPr>
@@ -3873,7 +3861,7 @@
       <w:pPr>
         <w:spacing w:after="0" w:line="480"/>
         <w:ind w:firstLine="720"/>
-        <w:jc w:val="left"/>
+        <w:jc w:val="both"/>
       </w:pPr>
       <w:r>
         <w:rPr>
@@ -4211,7 +4199,7 @@
       <w:pPr>
         <w:spacing w:after="0" w:line="480"/>
         <w:ind w:firstLine="720"/>
-        <w:jc w:val="left"/>
+        <w:jc w:val="both"/>
       </w:pPr>
       <w:r>
         <w:rPr>
@@ -4549,7 +4537,7 @@
       <w:pPr>
         <w:spacing w:after="0" w:line="480"/>
         <w:ind w:firstLine="720"/>
-        <w:jc w:val="left"/>
+        <w:jc w:val="both"/>
       </w:pPr>
       <w:r>
         <w:rPr>
@@ -4599,7 +4587,7 @@
       <w:pPr>
         <w:spacing w:after="0" w:line="480"/>
         <w:ind w:firstLine="720"/>
-        <w:jc w:val="left"/>
+        <w:jc w:val="both"/>
       </w:pPr>
       <w:r>
         <w:rPr>
@@ -5096,7 +5084,7 @@
       <w:pPr>
         <w:spacing w:after="0" w:line="480"/>
         <w:ind w:firstLine="720"/>
-        <w:jc w:val="left"/>
+        <w:jc w:val="both"/>
       </w:pPr>
       <w:r>
         <w:rPr>
@@ -5128,7 +5116,7 @@
       <w:pPr>
         <w:spacing w:after="0" w:line="480"/>
         <w:ind w:firstLine="720"/>
-        <w:jc w:val="left"/>
+        <w:jc w:val="both"/>
       </w:pPr>
       <w:r>
         <w:rPr>
@@ -5160,7 +5148,7 @@
       <w:pPr>
         <w:spacing w:after="0" w:line="480"/>
         <w:ind w:firstLine="720"/>
-        <w:jc w:val="left"/>
+        <w:jc w:val="both"/>
       </w:pPr>
       <w:r>
         <w:rPr>
@@ -5192,7 +5180,7 @@
       <w:pPr>
         <w:spacing w:after="0" w:line="480"/>
         <w:ind w:firstLine="720"/>
-        <w:jc w:val="left"/>
+        <w:jc w:val="both"/>
       </w:pPr>
       <w:r>
         <w:rPr>
@@ -6367,7 +6355,7 @@
       <w:pPr>
         <w:spacing w:after="0" w:line="480"/>
         <w:ind w:firstLine="720"/>
-        <w:jc w:val="left"/>
+        <w:jc w:val="both"/>
       </w:pPr>
       <w:r>
         <w:rPr>
@@ -7598,7 +7586,7 @@
       <w:pPr>
         <w:spacing w:after="0" w:line="480"/>
         <w:ind w:firstLine="720"/>
-        <w:jc w:val="left"/>
+        <w:jc w:val="both"/>
       </w:pPr>
       <w:r>
         <w:rPr>
@@ -8526,7 +8514,7 @@
       <w:pPr>
         <w:spacing w:after="0" w:line="480"/>
         <w:ind w:firstLine="720"/>
-        <w:jc w:val="left"/>
+        <w:jc w:val="both"/>
       </w:pPr>
       <w:r>
         <w:rPr>
@@ -8568,7 +8556,7 @@
       <w:pPr>
         <w:spacing w:after="0" w:line="480"/>
         <w:ind w:firstLine="720"/>
-        <w:jc w:val="left"/>
+        <w:jc w:val="both"/>
       </w:pPr>
       <w:r>
         <w:rPr>
@@ -8583,7 +8571,7 @@
       <w:pPr>
         <w:spacing w:after="0" w:line="480"/>
         <w:ind w:firstLine="720"/>
-        <w:jc w:val="left"/>
+        <w:jc w:val="both"/>
       </w:pPr>
       <w:r>
         <w:rPr>
@@ -8636,6 +8624,7 @@
           <w:numId w:val="2"/>
         </w:numPr>
         <w:spacing w:after="0" w:line="480"/>
+        <w:jc w:val="both"/>
       </w:pPr>
       <w:r>
         <w:rPr>
@@ -8654,6 +8643,7 @@
           <w:numId w:val="2"/>
         </w:numPr>
         <w:spacing w:after="0" w:line="480"/>
+        <w:jc w:val="both"/>
       </w:pPr>
       <w:r>
         <w:rPr>
@@ -8672,6 +8662,7 @@
           <w:numId w:val="2"/>
         </w:numPr>
         <w:spacing w:after="0" w:line="480"/>
+        <w:jc w:val="both"/>
       </w:pPr>
       <w:r>
         <w:rPr>
@@ -8690,6 +8681,7 @@
           <w:numId w:val="2"/>
         </w:numPr>
         <w:spacing w:after="0" w:line="480"/>
+        <w:jc w:val="both"/>
       </w:pPr>
       <w:r>
         <w:rPr>
@@ -8708,6 +8700,7 @@
           <w:numId w:val="2"/>
         </w:numPr>
         <w:spacing w:after="0" w:line="480"/>
+        <w:jc w:val="both"/>
       </w:pPr>
       <w:r>
         <w:rPr>
@@ -8743,6 +8736,7 @@
           <w:numId w:val="2"/>
         </w:numPr>
         <w:spacing w:after="0" w:line="480"/>
+        <w:jc w:val="both"/>
       </w:pPr>
       <w:r>
         <w:rPr>
@@ -8761,6 +8755,7 @@
           <w:numId w:val="2"/>
         </w:numPr>
         <w:spacing w:after="0" w:line="480"/>
+        <w:jc w:val="both"/>
       </w:pPr>
       <w:r>
         <w:rPr>
@@ -8779,6 +8774,7 @@
           <w:numId w:val="2"/>
         </w:numPr>
         <w:spacing w:after="0" w:line="480"/>
+        <w:jc w:val="both"/>
       </w:pPr>
       <w:r>
         <w:rPr>
@@ -8797,6 +8793,7 @@
           <w:numId w:val="2"/>
         </w:numPr>
         <w:spacing w:after="0" w:line="480"/>
+        <w:jc w:val="both"/>
       </w:pPr>
       <w:r>
         <w:rPr>
@@ -9150,7 +9147,7 @@
       <w:pPr>
         <w:spacing w:after="0" w:line="480"/>
         <w:ind w:firstLine="720"/>
-        <w:jc w:val="left"/>
+        <w:jc w:val="both"/>
       </w:pPr>
       <w:r>
         <w:rPr>
@@ -9165,7 +9162,7 @@
       <w:pPr>
         <w:spacing w:after="0" w:line="480"/>
         <w:ind w:firstLine="720"/>
-        <w:jc w:val="left"/>
+        <w:jc w:val="both"/>
       </w:pPr>
       <w:r>
         <w:rPr>
@@ -9197,7 +9194,7 @@
       <w:pPr>
         <w:spacing w:after="0" w:line="480"/>
         <w:ind w:firstLine="720"/>
-        <w:jc w:val="left"/>
+        <w:jc w:val="both"/>
       </w:pPr>
       <w:r>
         <w:rPr>
@@ -9229,7 +9226,7 @@
       <w:pPr>
         <w:spacing w:after="0" w:line="480"/>
         <w:ind w:firstLine="720"/>
-        <w:jc w:val="left"/>
+        <w:jc w:val="both"/>
       </w:pPr>
       <w:r>
         <w:rPr>

</xml_diff>

<commit_message>
docs: ajustar informe a normas APA 7 y centrar portada
</commit_message>
<xml_diff>
--- a/docs/informe/Informe_Tecnico.docx
+++ b/docs/informe/Informe_Tecnico.docx
@@ -202,7 +202,7 @@
       <w:pPr>
         <w:spacing w:after="0" w:line="480"/>
         <w:ind w:firstLine="720"/>
-        <w:jc w:val="both"/>
+        <w:jc w:val="left"/>
       </w:pPr>
       <w:r>
         <w:rPr>
@@ -217,7 +217,7 @@
       <w:pPr>
         <w:spacing w:after="0" w:line="480"/>
         <w:ind w:firstLine="720"/>
-        <w:jc w:val="both"/>
+        <w:jc w:val="left"/>
       </w:pPr>
       <w:r>
         <w:rPr>
@@ -250,7 +250,7 @@
       <w:pPr>
         <w:spacing w:after="0" w:line="480"/>
         <w:ind w:firstLine="720"/>
-        <w:jc w:val="both"/>
+        <w:jc w:val="left"/>
       </w:pPr>
       <w:r>
         <w:rPr>
@@ -282,7 +282,7 @@
       <w:pPr>
         <w:spacing w:after="0" w:line="480"/>
         <w:ind w:firstLine="720"/>
-        <w:jc w:val="both"/>
+        <w:jc w:val="left"/>
       </w:pPr>
       <w:r>
         <w:rPr>
@@ -301,7 +301,7 @@
           <w:numId w:val="2"/>
         </w:numPr>
         <w:spacing w:after="0" w:line="480"/>
-        <w:jc w:val="both"/>
+        <w:jc w:val="left"/>
       </w:pPr>
       <w:r>
         <w:rPr>
@@ -330,7 +330,7 @@
           <w:numId w:val="2"/>
         </w:numPr>
         <w:spacing w:after="0" w:line="480"/>
-        <w:jc w:val="both"/>
+        <w:jc w:val="left"/>
       </w:pPr>
       <w:r>
         <w:rPr>
@@ -359,7 +359,7 @@
           <w:numId w:val="2"/>
         </w:numPr>
         <w:spacing w:after="0" w:line="480"/>
-        <w:jc w:val="both"/>
+        <w:jc w:val="left"/>
       </w:pPr>
       <w:r>
         <w:rPr>
@@ -384,7 +384,7 @@
       <w:pPr>
         <w:spacing w:after="0" w:line="480"/>
         <w:ind w:firstLine="720"/>
-        <w:jc w:val="both"/>
+        <w:jc w:val="left"/>
       </w:pPr>
       <w:r>
         <w:rPr>
@@ -433,7 +433,7 @@
       <w:pPr>
         <w:spacing w:after="0" w:line="480"/>
         <w:ind w:firstLine="720"/>
-        <w:jc w:val="both"/>
+        <w:jc w:val="left"/>
       </w:pPr>
       <w:r>
         <w:rPr>
@@ -469,7 +469,7 @@
           <w:numId w:val="2"/>
         </w:numPr>
         <w:spacing w:after="0" w:line="480"/>
-        <w:jc w:val="both"/>
+        <w:jc w:val="left"/>
       </w:pPr>
       <w:r>
         <w:rPr>
@@ -488,7 +488,7 @@
           <w:numId w:val="2"/>
         </w:numPr>
         <w:spacing w:after="0" w:line="480"/>
-        <w:jc w:val="both"/>
+        <w:jc w:val="left"/>
       </w:pPr>
       <w:r>
         <w:rPr>
@@ -507,7 +507,7 @@
           <w:numId w:val="2"/>
         </w:numPr>
         <w:spacing w:after="0" w:line="480"/>
-        <w:jc w:val="both"/>
+        <w:jc w:val="left"/>
       </w:pPr>
       <w:r>
         <w:rPr>
@@ -526,7 +526,7 @@
           <w:numId w:val="2"/>
         </w:numPr>
         <w:spacing w:after="0" w:line="480"/>
-        <w:jc w:val="both"/>
+        <w:jc w:val="left"/>
       </w:pPr>
       <w:r>
         <w:rPr>
@@ -545,7 +545,7 @@
           <w:numId w:val="2"/>
         </w:numPr>
         <w:spacing w:after="0" w:line="480"/>
-        <w:jc w:val="both"/>
+        <w:jc w:val="left"/>
       </w:pPr>
       <w:r>
         <w:rPr>
@@ -577,7 +577,7 @@
       <w:pPr>
         <w:spacing w:after="0" w:line="480"/>
         <w:ind w:firstLine="720"/>
-        <w:jc w:val="both"/>
+        <w:jc w:val="left"/>
       </w:pPr>
       <w:r>
         <w:rPr>
@@ -602,7 +602,7 @@
       <w:pPr>
         <w:spacing w:after="0" w:line="480"/>
         <w:ind w:firstLine="720"/>
-        <w:jc w:val="both"/>
+        <w:jc w:val="left"/>
       </w:pPr>
       <w:r>
         <w:rPr>
@@ -627,7 +627,7 @@
       <w:pPr>
         <w:spacing w:after="0" w:line="480"/>
         <w:ind w:firstLine="720"/>
-        <w:jc w:val="both"/>
+        <w:jc w:val="left"/>
       </w:pPr>
       <w:r>
         <w:rPr>
@@ -652,7 +652,7 @@
       <w:pPr>
         <w:spacing w:after="0" w:line="480"/>
         <w:ind w:firstLine="720"/>
-        <w:jc w:val="both"/>
+        <w:jc w:val="left"/>
       </w:pPr>
       <w:r>
         <w:rPr>
@@ -711,7 +711,7 @@
       <w:pPr>
         <w:spacing w:after="0" w:line="480"/>
         <w:ind w:firstLine="720"/>
-        <w:jc w:val="both"/>
+        <w:jc w:val="left"/>
       </w:pPr>
       <w:r>
         <w:rPr>
@@ -797,7 +797,7 @@
       <w:pPr>
         <w:spacing w:after="0" w:line="480"/>
         <w:ind w:firstLine="720"/>
-        <w:jc w:val="both"/>
+        <w:jc w:val="left"/>
       </w:pPr>
       <w:r>
         <w:rPr>
@@ -937,7 +937,7 @@
       <w:pPr>
         <w:spacing w:after="0" w:line="480"/>
         <w:ind w:firstLine="720"/>
-        <w:jc w:val="both"/>
+        <w:jc w:val="left"/>
       </w:pPr>
       <w:r>
         <w:rPr>
@@ -1166,7 +1166,7 @@
       <w:pPr>
         <w:spacing w:after="0" w:line="480"/>
         <w:ind w:firstLine="720"/>
-        <w:jc w:val="both"/>
+        <w:jc w:val="left"/>
       </w:pPr>
       <w:r>
         <w:rPr>
@@ -1261,7 +1261,7 @@
       <w:pPr>
         <w:spacing w:after="0" w:line="480"/>
         <w:ind w:firstLine="720"/>
-        <w:jc w:val="both"/>
+        <w:jc w:val="left"/>
       </w:pPr>
       <w:r>
         <w:rPr>
@@ -1293,7 +1293,7 @@
       <w:pPr>
         <w:spacing w:after="0" w:line="480"/>
         <w:ind w:firstLine="720"/>
-        <w:jc w:val="both"/>
+        <w:jc w:val="left"/>
       </w:pPr>
       <w:r>
         <w:rPr>
@@ -1372,7 +1372,7 @@
       <w:pPr>
         <w:spacing w:after="0" w:line="480"/>
         <w:ind w:firstLine="720"/>
-        <w:jc w:val="both"/>
+        <w:jc w:val="left"/>
       </w:pPr>
       <w:r>
         <w:rPr>
@@ -1404,7 +1404,7 @@
       <w:pPr>
         <w:spacing w:after="0" w:line="480"/>
         <w:ind w:firstLine="720"/>
-        <w:jc w:val="both"/>
+        <w:jc w:val="left"/>
       </w:pPr>
       <w:r>
         <w:rPr>
@@ -1483,7 +1483,7 @@
       <w:pPr>
         <w:spacing w:after="0" w:line="480"/>
         <w:ind w:firstLine="720"/>
-        <w:jc w:val="both"/>
+        <w:jc w:val="left"/>
       </w:pPr>
       <w:r>
         <w:rPr>
@@ -2040,7 +2040,7 @@
       <w:pPr>
         <w:spacing w:after="0" w:line="480"/>
         <w:ind w:firstLine="720"/>
-        <w:jc w:val="both"/>
+        <w:jc w:val="left"/>
       </w:pPr>
       <w:r>
         <w:rPr>
@@ -2395,7 +2395,7 @@
       <w:pPr>
         <w:spacing w:after="0" w:line="480"/>
         <w:ind w:firstLine="720"/>
-        <w:jc w:val="both"/>
+        <w:jc w:val="left"/>
       </w:pPr>
       <w:r>
         <w:rPr>
@@ -2529,7 +2529,7 @@
       <w:pPr>
         <w:spacing w:after="0" w:line="480"/>
         <w:ind w:firstLine="720"/>
-        <w:jc w:val="both"/>
+        <w:jc w:val="left"/>
       </w:pPr>
       <w:r>
         <w:rPr>
@@ -3593,7 +3593,7 @@
       <w:pPr>
         <w:spacing w:after="0" w:line="480"/>
         <w:ind w:firstLine="720"/>
-        <w:jc w:val="both"/>
+        <w:jc w:val="left"/>
       </w:pPr>
       <w:r>
         <w:rPr>
@@ -3625,7 +3625,7 @@
       <w:pPr>
         <w:spacing w:after="0" w:line="480"/>
         <w:ind w:firstLine="720"/>
-        <w:jc w:val="both"/>
+        <w:jc w:val="left"/>
       </w:pPr>
       <w:r>
         <w:rPr>
@@ -3861,7 +3861,7 @@
       <w:pPr>
         <w:spacing w:after="0" w:line="480"/>
         <w:ind w:firstLine="720"/>
-        <w:jc w:val="both"/>
+        <w:jc w:val="left"/>
       </w:pPr>
       <w:r>
         <w:rPr>
@@ -4199,7 +4199,7 @@
       <w:pPr>
         <w:spacing w:after="0" w:line="480"/>
         <w:ind w:firstLine="720"/>
-        <w:jc w:val="both"/>
+        <w:jc w:val="left"/>
       </w:pPr>
       <w:r>
         <w:rPr>
@@ -4537,7 +4537,7 @@
       <w:pPr>
         <w:spacing w:after="0" w:line="480"/>
         <w:ind w:firstLine="720"/>
-        <w:jc w:val="both"/>
+        <w:jc w:val="left"/>
       </w:pPr>
       <w:r>
         <w:rPr>
@@ -4587,7 +4587,7 @@
       <w:pPr>
         <w:spacing w:after="0" w:line="480"/>
         <w:ind w:firstLine="720"/>
-        <w:jc w:val="both"/>
+        <w:jc w:val="left"/>
       </w:pPr>
       <w:r>
         <w:rPr>
@@ -5084,7 +5084,7 @@
       <w:pPr>
         <w:spacing w:after="0" w:line="480"/>
         <w:ind w:firstLine="720"/>
-        <w:jc w:val="both"/>
+        <w:jc w:val="left"/>
       </w:pPr>
       <w:r>
         <w:rPr>
@@ -5116,7 +5116,7 @@
       <w:pPr>
         <w:spacing w:after="0" w:line="480"/>
         <w:ind w:firstLine="720"/>
-        <w:jc w:val="both"/>
+        <w:jc w:val="left"/>
       </w:pPr>
       <w:r>
         <w:rPr>
@@ -5148,7 +5148,7 @@
       <w:pPr>
         <w:spacing w:after="0" w:line="480"/>
         <w:ind w:firstLine="720"/>
-        <w:jc w:val="both"/>
+        <w:jc w:val="left"/>
       </w:pPr>
       <w:r>
         <w:rPr>
@@ -5180,7 +5180,7 @@
       <w:pPr>
         <w:spacing w:after="0" w:line="480"/>
         <w:ind w:firstLine="720"/>
-        <w:jc w:val="both"/>
+        <w:jc w:val="left"/>
       </w:pPr>
       <w:r>
         <w:rPr>
@@ -6355,7 +6355,7 @@
       <w:pPr>
         <w:spacing w:after="0" w:line="480"/>
         <w:ind w:firstLine="720"/>
-        <w:jc w:val="both"/>
+        <w:jc w:val="left"/>
       </w:pPr>
       <w:r>
         <w:rPr>
@@ -7586,7 +7586,7 @@
       <w:pPr>
         <w:spacing w:after="0" w:line="480"/>
         <w:ind w:firstLine="720"/>
-        <w:jc w:val="both"/>
+        <w:jc w:val="left"/>
       </w:pPr>
       <w:r>
         <w:rPr>
@@ -8514,7 +8514,7 @@
       <w:pPr>
         <w:spacing w:after="0" w:line="480"/>
         <w:ind w:firstLine="720"/>
-        <w:jc w:val="both"/>
+        <w:jc w:val="left"/>
       </w:pPr>
       <w:r>
         <w:rPr>
@@ -8556,7 +8556,7 @@
       <w:pPr>
         <w:spacing w:after="0" w:line="480"/>
         <w:ind w:firstLine="720"/>
-        <w:jc w:val="both"/>
+        <w:jc w:val="left"/>
       </w:pPr>
       <w:r>
         <w:rPr>
@@ -8571,7 +8571,7 @@
       <w:pPr>
         <w:spacing w:after="0" w:line="480"/>
         <w:ind w:firstLine="720"/>
-        <w:jc w:val="both"/>
+        <w:jc w:val="left"/>
       </w:pPr>
       <w:r>
         <w:rPr>
@@ -8624,7 +8624,7 @@
           <w:numId w:val="2"/>
         </w:numPr>
         <w:spacing w:after="0" w:line="480"/>
-        <w:jc w:val="both"/>
+        <w:jc w:val="left"/>
       </w:pPr>
       <w:r>
         <w:rPr>
@@ -8643,7 +8643,7 @@
           <w:numId w:val="2"/>
         </w:numPr>
         <w:spacing w:after="0" w:line="480"/>
-        <w:jc w:val="both"/>
+        <w:jc w:val="left"/>
       </w:pPr>
       <w:r>
         <w:rPr>
@@ -8662,7 +8662,7 @@
           <w:numId w:val="2"/>
         </w:numPr>
         <w:spacing w:after="0" w:line="480"/>
-        <w:jc w:val="both"/>
+        <w:jc w:val="left"/>
       </w:pPr>
       <w:r>
         <w:rPr>
@@ -8681,7 +8681,7 @@
           <w:numId w:val="2"/>
         </w:numPr>
         <w:spacing w:after="0" w:line="480"/>
-        <w:jc w:val="both"/>
+        <w:jc w:val="left"/>
       </w:pPr>
       <w:r>
         <w:rPr>
@@ -8700,7 +8700,7 @@
           <w:numId w:val="2"/>
         </w:numPr>
         <w:spacing w:after="0" w:line="480"/>
-        <w:jc w:val="both"/>
+        <w:jc w:val="left"/>
       </w:pPr>
       <w:r>
         <w:rPr>
@@ -8736,7 +8736,7 @@
           <w:numId w:val="2"/>
         </w:numPr>
         <w:spacing w:after="0" w:line="480"/>
-        <w:jc w:val="both"/>
+        <w:jc w:val="left"/>
       </w:pPr>
       <w:r>
         <w:rPr>
@@ -8755,7 +8755,7 @@
           <w:numId w:val="2"/>
         </w:numPr>
         <w:spacing w:after="0" w:line="480"/>
-        <w:jc w:val="both"/>
+        <w:jc w:val="left"/>
       </w:pPr>
       <w:r>
         <w:rPr>
@@ -8774,7 +8774,7 @@
           <w:numId w:val="2"/>
         </w:numPr>
         <w:spacing w:after="0" w:line="480"/>
-        <w:jc w:val="both"/>
+        <w:jc w:val="left"/>
       </w:pPr>
       <w:r>
         <w:rPr>
@@ -8793,7 +8793,7 @@
           <w:numId w:val="2"/>
         </w:numPr>
         <w:spacing w:after="0" w:line="480"/>
-        <w:jc w:val="both"/>
+        <w:jc w:val="left"/>
       </w:pPr>
       <w:r>
         <w:rPr>
@@ -9147,7 +9147,7 @@
       <w:pPr>
         <w:spacing w:after="0" w:line="480"/>
         <w:ind w:firstLine="720"/>
-        <w:jc w:val="both"/>
+        <w:jc w:val="left"/>
       </w:pPr>
       <w:r>
         <w:rPr>
@@ -9162,7 +9162,7 @@
       <w:pPr>
         <w:spacing w:after="0" w:line="480"/>
         <w:ind w:firstLine="720"/>
-        <w:jc w:val="both"/>
+        <w:jc w:val="left"/>
       </w:pPr>
       <w:r>
         <w:rPr>
@@ -9194,7 +9194,7 @@
       <w:pPr>
         <w:spacing w:after="0" w:line="480"/>
         <w:ind w:firstLine="720"/>
-        <w:jc w:val="both"/>
+        <w:jc w:val="left"/>
       </w:pPr>
       <w:r>
         <w:rPr>
@@ -9226,7 +9226,7 @@
       <w:pPr>
         <w:spacing w:after="0" w:line="480"/>
         <w:ind w:firstLine="720"/>
-        <w:jc w:val="both"/>
+        <w:jc w:val="left"/>
       </w:pPr>
       <w:r>
         <w:rPr>

</xml_diff>

<commit_message>
docs: informe con texto justificado y portada centrada
</commit_message>
<xml_diff>
--- a/docs/informe/Informe_Tecnico.docx
+++ b/docs/informe/Informe_Tecnico.docx
@@ -202,7 +202,7 @@
       <w:pPr>
         <w:spacing w:after="0" w:line="480"/>
         <w:ind w:firstLine="720"/>
-        <w:jc w:val="left"/>
+        <w:jc w:val="both"/>
       </w:pPr>
       <w:r>
         <w:rPr>
@@ -217,7 +217,7 @@
       <w:pPr>
         <w:spacing w:after="0" w:line="480"/>
         <w:ind w:firstLine="720"/>
-        <w:jc w:val="left"/>
+        <w:jc w:val="both"/>
       </w:pPr>
       <w:r>
         <w:rPr>
@@ -250,7 +250,7 @@
       <w:pPr>
         <w:spacing w:after="0" w:line="480"/>
         <w:ind w:firstLine="720"/>
-        <w:jc w:val="left"/>
+        <w:jc w:val="both"/>
       </w:pPr>
       <w:r>
         <w:rPr>
@@ -282,7 +282,7 @@
       <w:pPr>
         <w:spacing w:after="0" w:line="480"/>
         <w:ind w:firstLine="720"/>
-        <w:jc w:val="left"/>
+        <w:jc w:val="both"/>
       </w:pPr>
       <w:r>
         <w:rPr>
@@ -384,7 +384,7 @@
       <w:pPr>
         <w:spacing w:after="0" w:line="480"/>
         <w:ind w:firstLine="720"/>
-        <w:jc w:val="left"/>
+        <w:jc w:val="both"/>
       </w:pPr>
       <w:r>
         <w:rPr>
@@ -433,7 +433,7 @@
       <w:pPr>
         <w:spacing w:after="0" w:line="480"/>
         <w:ind w:firstLine="720"/>
-        <w:jc w:val="left"/>
+        <w:jc w:val="both"/>
       </w:pPr>
       <w:r>
         <w:rPr>
@@ -577,7 +577,7 @@
       <w:pPr>
         <w:spacing w:after="0" w:line="480"/>
         <w:ind w:firstLine="720"/>
-        <w:jc w:val="left"/>
+        <w:jc w:val="both"/>
       </w:pPr>
       <w:r>
         <w:rPr>
@@ -602,7 +602,7 @@
       <w:pPr>
         <w:spacing w:after="0" w:line="480"/>
         <w:ind w:firstLine="720"/>
-        <w:jc w:val="left"/>
+        <w:jc w:val="both"/>
       </w:pPr>
       <w:r>
         <w:rPr>
@@ -627,7 +627,7 @@
       <w:pPr>
         <w:spacing w:after="0" w:line="480"/>
         <w:ind w:firstLine="720"/>
-        <w:jc w:val="left"/>
+        <w:jc w:val="both"/>
       </w:pPr>
       <w:r>
         <w:rPr>
@@ -652,7 +652,7 @@
       <w:pPr>
         <w:spacing w:after="0" w:line="480"/>
         <w:ind w:firstLine="720"/>
-        <w:jc w:val="left"/>
+        <w:jc w:val="both"/>
       </w:pPr>
       <w:r>
         <w:rPr>
@@ -711,7 +711,7 @@
       <w:pPr>
         <w:spacing w:after="0" w:line="480"/>
         <w:ind w:firstLine="720"/>
-        <w:jc w:val="left"/>
+        <w:jc w:val="both"/>
       </w:pPr>
       <w:r>
         <w:rPr>
@@ -797,7 +797,7 @@
       <w:pPr>
         <w:spacing w:after="0" w:line="480"/>
         <w:ind w:firstLine="720"/>
-        <w:jc w:val="left"/>
+        <w:jc w:val="both"/>
       </w:pPr>
       <w:r>
         <w:rPr>
@@ -937,7 +937,7 @@
       <w:pPr>
         <w:spacing w:after="0" w:line="480"/>
         <w:ind w:firstLine="720"/>
-        <w:jc w:val="left"/>
+        <w:jc w:val="both"/>
       </w:pPr>
       <w:r>
         <w:rPr>
@@ -1166,7 +1166,7 @@
       <w:pPr>
         <w:spacing w:after="0" w:line="480"/>
         <w:ind w:firstLine="720"/>
-        <w:jc w:val="left"/>
+        <w:jc w:val="both"/>
       </w:pPr>
       <w:r>
         <w:rPr>
@@ -1261,7 +1261,7 @@
       <w:pPr>
         <w:spacing w:after="0" w:line="480"/>
         <w:ind w:firstLine="720"/>
-        <w:jc w:val="left"/>
+        <w:jc w:val="both"/>
       </w:pPr>
       <w:r>
         <w:rPr>
@@ -1293,7 +1293,7 @@
       <w:pPr>
         <w:spacing w:after="0" w:line="480"/>
         <w:ind w:firstLine="720"/>
-        <w:jc w:val="left"/>
+        <w:jc w:val="both"/>
       </w:pPr>
       <w:r>
         <w:rPr>
@@ -1372,7 +1372,7 @@
       <w:pPr>
         <w:spacing w:after="0" w:line="480"/>
         <w:ind w:firstLine="720"/>
-        <w:jc w:val="left"/>
+        <w:jc w:val="both"/>
       </w:pPr>
       <w:r>
         <w:rPr>
@@ -1404,7 +1404,7 @@
       <w:pPr>
         <w:spacing w:after="0" w:line="480"/>
         <w:ind w:firstLine="720"/>
-        <w:jc w:val="left"/>
+        <w:jc w:val="both"/>
       </w:pPr>
       <w:r>
         <w:rPr>
@@ -1483,7 +1483,7 @@
       <w:pPr>
         <w:spacing w:after="0" w:line="480"/>
         <w:ind w:firstLine="720"/>
-        <w:jc w:val="left"/>
+        <w:jc w:val="both"/>
       </w:pPr>
       <w:r>
         <w:rPr>
@@ -2040,7 +2040,7 @@
       <w:pPr>
         <w:spacing w:after="0" w:line="480"/>
         <w:ind w:firstLine="720"/>
-        <w:jc w:val="left"/>
+        <w:jc w:val="both"/>
       </w:pPr>
       <w:r>
         <w:rPr>
@@ -2395,7 +2395,7 @@
       <w:pPr>
         <w:spacing w:after="0" w:line="480"/>
         <w:ind w:firstLine="720"/>
-        <w:jc w:val="left"/>
+        <w:jc w:val="both"/>
       </w:pPr>
       <w:r>
         <w:rPr>
@@ -2529,7 +2529,7 @@
       <w:pPr>
         <w:spacing w:after="0" w:line="480"/>
         <w:ind w:firstLine="720"/>
-        <w:jc w:val="left"/>
+        <w:jc w:val="both"/>
       </w:pPr>
       <w:r>
         <w:rPr>
@@ -3593,7 +3593,7 @@
       <w:pPr>
         <w:spacing w:after="0" w:line="480"/>
         <w:ind w:firstLine="720"/>
-        <w:jc w:val="left"/>
+        <w:jc w:val="both"/>
       </w:pPr>
       <w:r>
         <w:rPr>
@@ -3625,7 +3625,7 @@
       <w:pPr>
         <w:spacing w:after="0" w:line="480"/>
         <w:ind w:firstLine="720"/>
-        <w:jc w:val="left"/>
+        <w:jc w:val="both"/>
       </w:pPr>
       <w:r>
         <w:rPr>
@@ -3861,7 +3861,7 @@
       <w:pPr>
         <w:spacing w:after="0" w:line="480"/>
         <w:ind w:firstLine="720"/>
-        <w:jc w:val="left"/>
+        <w:jc w:val="both"/>
       </w:pPr>
       <w:r>
         <w:rPr>
@@ -4199,7 +4199,7 @@
       <w:pPr>
         <w:spacing w:after="0" w:line="480"/>
         <w:ind w:firstLine="720"/>
-        <w:jc w:val="left"/>
+        <w:jc w:val="both"/>
       </w:pPr>
       <w:r>
         <w:rPr>
@@ -4537,7 +4537,7 @@
       <w:pPr>
         <w:spacing w:after="0" w:line="480"/>
         <w:ind w:firstLine="720"/>
-        <w:jc w:val="left"/>
+        <w:jc w:val="both"/>
       </w:pPr>
       <w:r>
         <w:rPr>
@@ -4587,7 +4587,7 @@
       <w:pPr>
         <w:spacing w:after="0" w:line="480"/>
         <w:ind w:firstLine="720"/>
-        <w:jc w:val="left"/>
+        <w:jc w:val="both"/>
       </w:pPr>
       <w:r>
         <w:rPr>
@@ -5084,7 +5084,7 @@
       <w:pPr>
         <w:spacing w:after="0" w:line="480"/>
         <w:ind w:firstLine="720"/>
-        <w:jc w:val="left"/>
+        <w:jc w:val="both"/>
       </w:pPr>
       <w:r>
         <w:rPr>
@@ -5116,7 +5116,7 @@
       <w:pPr>
         <w:spacing w:after="0" w:line="480"/>
         <w:ind w:firstLine="720"/>
-        <w:jc w:val="left"/>
+        <w:jc w:val="both"/>
       </w:pPr>
       <w:r>
         <w:rPr>
@@ -5148,7 +5148,7 @@
       <w:pPr>
         <w:spacing w:after="0" w:line="480"/>
         <w:ind w:firstLine="720"/>
-        <w:jc w:val="left"/>
+        <w:jc w:val="both"/>
       </w:pPr>
       <w:r>
         <w:rPr>
@@ -5180,7 +5180,7 @@
       <w:pPr>
         <w:spacing w:after="0" w:line="480"/>
         <w:ind w:firstLine="720"/>
-        <w:jc w:val="left"/>
+        <w:jc w:val="both"/>
       </w:pPr>
       <w:r>
         <w:rPr>
@@ -6355,7 +6355,7 @@
       <w:pPr>
         <w:spacing w:after="0" w:line="480"/>
         <w:ind w:firstLine="720"/>
-        <w:jc w:val="left"/>
+        <w:jc w:val="both"/>
       </w:pPr>
       <w:r>
         <w:rPr>
@@ -7586,7 +7586,7 @@
       <w:pPr>
         <w:spacing w:after="0" w:line="480"/>
         <w:ind w:firstLine="720"/>
-        <w:jc w:val="left"/>
+        <w:jc w:val="both"/>
       </w:pPr>
       <w:r>
         <w:rPr>
@@ -8514,7 +8514,7 @@
       <w:pPr>
         <w:spacing w:after="0" w:line="480"/>
         <w:ind w:firstLine="720"/>
-        <w:jc w:val="left"/>
+        <w:jc w:val="both"/>
       </w:pPr>
       <w:r>
         <w:rPr>
@@ -8556,7 +8556,7 @@
       <w:pPr>
         <w:spacing w:after="0" w:line="480"/>
         <w:ind w:firstLine="720"/>
-        <w:jc w:val="left"/>
+        <w:jc w:val="both"/>
       </w:pPr>
       <w:r>
         <w:rPr>
@@ -8571,7 +8571,7 @@
       <w:pPr>
         <w:spacing w:after="0" w:line="480"/>
         <w:ind w:firstLine="720"/>
-        <w:jc w:val="left"/>
+        <w:jc w:val="both"/>
       </w:pPr>
       <w:r>
         <w:rPr>
@@ -9147,7 +9147,7 @@
       <w:pPr>
         <w:spacing w:after="0" w:line="480"/>
         <w:ind w:firstLine="720"/>
-        <w:jc w:val="left"/>
+        <w:jc w:val="both"/>
       </w:pPr>
       <w:r>
         <w:rPr>
@@ -9162,7 +9162,7 @@
       <w:pPr>
         <w:spacing w:after="0" w:line="480"/>
         <w:ind w:firstLine="720"/>
-        <w:jc w:val="left"/>
+        <w:jc w:val="both"/>
       </w:pPr>
       <w:r>
         <w:rPr>
@@ -9194,7 +9194,7 @@
       <w:pPr>
         <w:spacing w:after="0" w:line="480"/>
         <w:ind w:firstLine="720"/>
-        <w:jc w:val="left"/>
+        <w:jc w:val="both"/>
       </w:pPr>
       <w:r>
         <w:rPr>
@@ -9226,7 +9226,7 @@
       <w:pPr>
         <w:spacing w:after="0" w:line="480"/>
         <w:ind w:firstLine="720"/>
-        <w:jc w:val="left"/>
+        <w:jc w:val="both"/>
       </w:pPr>
       <w:r>
         <w:rPr>

</xml_diff>